<commit_message>
Update document templates and enhance Excel processing for expanded sheets
</commit_message>
<xml_diff>
--- a/Modelos_documentos/oficio_docente_contrato.docx
+++ b/Modelos_documentos/oficio_docente_contrato.docx
@@ -69,7 +69,23 @@
           <w:sz w:val="24"/>
           <w:szCs w:val="24"/>
         </w:rPr>
-        <w:t>-2025-DGICEID-D-</w:t>
+        <w:t>-202</w:t>
+      </w:r>
+      <w:r>
+        <w:rPr>
+          <w:rFonts w:ascii="Garamond" w:hAnsi="Garamond"/>
+          <w:sz w:val="24"/>
+          <w:szCs w:val="24"/>
+        </w:rPr>
+        <w:t>6</w:t>
+      </w:r>
+      <w:r>
+        <w:rPr>
+          <w:rFonts w:ascii="Garamond" w:hAnsi="Garamond"/>
+          <w:sz w:val="24"/>
+          <w:szCs w:val="24"/>
+        </w:rPr>
+        <w:t>-DGICEID-D-</w:t>
       </w:r>
       <w:r>
         <w:rPr>
@@ -143,7 +159,7 @@
           <w:szCs w:val="24"/>
           <w:lang w:val="es-PE"/>
         </w:rPr>
-        <w:t>27 de Febrero de 2026</w:t>
+        <w:t>11 de Marzo de 2026</w:t>
       </w:r>
       <w:r>
         <w:rPr>
@@ -381,7 +397,19 @@
         <w:rPr>
           <w:rFonts w:ascii="Garamond" w:hAnsi="Garamond"/>
         </w:rPr>
-        <w:t>/UNMSM-FLCH/2025-</w:t>
+        <w:t>/UNMSM-FLCH/202</w:t>
+      </w:r>
+      <w:r>
+        <w:rPr>
+          <w:rFonts w:ascii="Garamond" w:hAnsi="Garamond"/>
+        </w:rPr>
+        <w:t>6</w:t>
+      </w:r>
+      <w:r>
+        <w:rPr>
+          <w:rFonts w:ascii="Garamond" w:hAnsi="Garamond"/>
+        </w:rPr>
+        <w:t>-</w:t>
       </w:r>
       <w:r>
         <w:rPr>
@@ -564,12 +592,14 @@
         <w:rPr>
           <w:rFonts w:ascii="Garamond" w:eastAsia="Arial MT" w:hAnsi="Garamond" w:cs="Arial"/>
           <w:spacing w:val="1"/>
+          <w:lang w:val="it-IT"/>
         </w:rPr>
       </w:pPr>
       <w:r>
         <w:rPr>
           <w:rFonts w:ascii="Garamond" w:eastAsia="Arial MT" w:hAnsi="Garamond" w:cs="Arial"/>
           <w:spacing w:val="1"/>
+          <w:lang w:val="it-IT"/>
         </w:rPr>
         <w:t>Atentamente,</w:t>
       </w:r>
@@ -579,6 +609,7 @@
         <w:pStyle w:val="Textoindependiente"/>
         <w:rPr>
           <w:rFonts w:ascii="Garamond" w:hAnsi="Garamond"/>
+          <w:lang w:val="it-IT"/>
         </w:rPr>
       </w:pPr>
     </w:p>
@@ -587,6 +618,7 @@
         <w:pStyle w:val="Textoindependiente"/>
         <w:rPr>
           <w:rFonts w:ascii="Garamond" w:hAnsi="Garamond"/>
+          <w:lang w:val="it-IT"/>
         </w:rPr>
       </w:pPr>
     </w:p>
@@ -595,6 +627,7 @@
         <w:pStyle w:val="Textoindependiente"/>
         <w:rPr>
           <w:rFonts w:ascii="Garamond" w:hAnsi="Garamond"/>
+          <w:lang w:val="it-IT"/>
         </w:rPr>
       </w:pPr>
     </w:p>
@@ -603,6 +636,7 @@
         <w:pStyle w:val="Textoindependiente"/>
         <w:rPr>
           <w:rFonts w:ascii="Garamond" w:hAnsi="Garamond"/>
+          <w:lang w:val="it-IT"/>
         </w:rPr>
       </w:pPr>
     </w:p>
@@ -612,6 +646,7 @@
         <w:spacing w:before="241"/>
         <w:rPr>
           <w:rFonts w:ascii="Garamond" w:hAnsi="Garamond"/>
+          <w:lang w:val="it-IT"/>
         </w:rPr>
       </w:pPr>
     </w:p>
@@ -624,6 +659,7 @@
           <w:rFonts w:ascii="Garamond" w:hAnsi="Garamond"/>
           <w:b/>
           <w:szCs w:val="22"/>
+          <w:lang w:val="it-IT"/>
         </w:rPr>
       </w:pPr>
       <w:r>
@@ -631,6 +667,7 @@
           <w:rFonts w:ascii="Garamond" w:hAnsi="Garamond"/>
           <w:b/>
           <w:szCs w:val="22"/>
+          <w:lang w:val="it-IT"/>
         </w:rPr>
         <w:t>Dr. Guillaume Yannick Serge Oisel</w:t>
       </w:r>

</xml_diff>